<commit_message>
Refresh ticket dataset and update assignment deliverables.
Regenerate synthetic tickets through Jul 1 2026, apply consistent table formatting across assignment docs, update Part B content, and add the document merge script.

Co-authored-by: Cursor <cursoragent@cursor.com>
</commit_message>
<xml_diff>
--- a/Part-A-AI-in-TAM-Work.docx
+++ b/Part-A-AI-in-TAM-Work.docx
@@ -550,9 +550,18 @@
     </w:p>
     <w:tbl>
       <w:tblPr>
-        <w:tblStyle w:val="Sinch"/>
+        <w:tblStyle w:val="TableGrid"/>
         <w:tblW w:type="auto" w:w="0"/>
         <w:tblLook w:firstColumn="1" w:firstRow="1" w:lastColumn="0" w:lastRow="0" w:noHBand="0" w:noVBand="1" w:val="04A0"/>
+        <w:jc w:val="center"/>
+        <w:tblBorders>
+          <w:top w:val="single" w:sz="4" w:space="0" w:color="B7C0CC"/>
+          <w:left w:val="single" w:sz="4" w:space="0" w:color="B7C0CC"/>
+          <w:bottom w:val="single" w:sz="4" w:space="0" w:color="B7C0CC"/>
+          <w:right w:val="single" w:sz="4" w:space="0" w:color="B7C0CC"/>
+          <w:insideH w:val="single" w:sz="4" w:space="0" w:color="B7C0CC"/>
+          <w:insideV w:val="single" w:sz="4" w:space="0" w:color="B7C0CC"/>
+        </w:tblBorders>
       </w:tblPr>
       <w:tblGrid>
         <w:gridCol w:w="3364"/>
@@ -563,11 +572,25 @@
         <w:tc>
           <w:tcPr>
             <w:tcW w:type="dxa" w:w="3364"/>
+            <w:vAlign w:val="center"/>
+            <w:tcMar>
+              <w:top w:w="60" w:type="dxa"/>
+              <w:bottom w:w="60" w:type="dxa"/>
+              <w:left w:w="110" w:type="dxa"/>
+              <w:right w:w="110" w:type="dxa"/>
+            </w:tcMar>
+            <w:shd w:val="clear" w:color="auto" w:fill="1B3A5B"/>
           </w:tcPr>
           <w:p>
+            <w:pPr>
+              <w:spacing w:after="40" w:before="40"/>
+            </w:pPr>
             <w:r>
               <w:rPr>
-                <w:b/>
+                <w:b w:val="true"/>
+                <w:color w:val="FFFFFF"/>
+                <w:sz w:val="24"/>
+                <w:szCs w:val="24"/>
               </w:rPr>
               <w:t>Use case</w:t>
             </w:r>
@@ -576,11 +599,25 @@
         <w:tc>
           <w:tcPr>
             <w:tcW w:type="dxa" w:w="3364"/>
+            <w:vAlign w:val="center"/>
+            <w:tcMar>
+              <w:top w:w="60" w:type="dxa"/>
+              <w:bottom w:w="60" w:type="dxa"/>
+              <w:left w:w="110" w:type="dxa"/>
+              <w:right w:w="110" w:type="dxa"/>
+            </w:tcMar>
+            <w:shd w:val="clear" w:color="auto" w:fill="1B3A5B"/>
           </w:tcPr>
           <w:p>
+            <w:pPr>
+              <w:spacing w:after="40" w:before="40"/>
+            </w:pPr>
             <w:r>
               <w:rPr>
-                <w:b/>
+                <w:b w:val="true"/>
+                <w:color w:val="FFFFFF"/>
+                <w:sz w:val="24"/>
+                <w:szCs w:val="24"/>
               </w:rPr>
               <w:t>AI tool(s)</w:t>
             </w:r>
@@ -589,11 +626,25 @@
         <w:tc>
           <w:tcPr>
             <w:tcW w:type="dxa" w:w="3364"/>
+            <w:vAlign w:val="center"/>
+            <w:tcMar>
+              <w:top w:w="60" w:type="dxa"/>
+              <w:bottom w:w="60" w:type="dxa"/>
+              <w:left w:w="110" w:type="dxa"/>
+              <w:right w:w="110" w:type="dxa"/>
+            </w:tcMar>
+            <w:shd w:val="clear" w:color="auto" w:fill="1B3A5B"/>
           </w:tcPr>
           <w:p>
+            <w:pPr>
+              <w:spacing w:after="40" w:before="40"/>
+            </w:pPr>
             <w:r>
               <w:rPr>
-                <w:b/>
+                <w:b w:val="true"/>
+                <w:color w:val="FFFFFF"/>
+                <w:sz w:val="24"/>
+                <w:szCs w:val="24"/>
               </w:rPr>
               <w:t>Main gain</w:t>
             </w:r>
@@ -604,9 +655,23 @@
         <w:tc>
           <w:tcPr>
             <w:tcW w:type="dxa" w:w="3364"/>
+            <w:vAlign w:val="center"/>
+            <w:tcMar>
+              <w:top w:w="60" w:type="dxa"/>
+              <w:bottom w:w="60" w:type="dxa"/>
+              <w:left w:w="110" w:type="dxa"/>
+              <w:right w:w="110" w:type="dxa"/>
+            </w:tcMar>
           </w:tcPr>
           <w:p>
+            <w:pPr>
+              <w:spacing w:after="40" w:before="40"/>
+            </w:pPr>
             <w:r>
+              <w:rPr>
+                <w:sz w:val="22"/>
+                <w:szCs w:val="22"/>
+              </w:rPr>
               <w:t>Improving customer replies</w:t>
             </w:r>
           </w:p>
@@ -614,9 +679,23 @@
         <w:tc>
           <w:tcPr>
             <w:tcW w:type="dxa" w:w="3364"/>
+            <w:vAlign w:val="center"/>
+            <w:tcMar>
+              <w:top w:w="60" w:type="dxa"/>
+              <w:bottom w:w="60" w:type="dxa"/>
+              <w:left w:w="110" w:type="dxa"/>
+              <w:right w:w="110" w:type="dxa"/>
+            </w:tcMar>
           </w:tcPr>
           <w:p>
+            <w:pPr>
+              <w:spacing w:after="40" w:before="40"/>
+            </w:pPr>
             <w:r>
+              <w:rPr>
+                <w:sz w:val="22"/>
+                <w:szCs w:val="22"/>
+              </w:rPr>
               <w:t>ChatGPT, Microsoft Copilot</w:t>
             </w:r>
           </w:p>
@@ -624,9 +703,23 @@
         <w:tc>
           <w:tcPr>
             <w:tcW w:type="dxa" w:w="3364"/>
+            <w:vAlign w:val="center"/>
+            <w:tcMar>
+              <w:top w:w="60" w:type="dxa"/>
+              <w:bottom w:w="60" w:type="dxa"/>
+              <w:left w:w="110" w:type="dxa"/>
+              <w:right w:w="110" w:type="dxa"/>
+            </w:tcMar>
           </w:tcPr>
           <w:p>
+            <w:pPr>
+              <w:spacing w:after="40" w:before="40"/>
+            </w:pPr>
             <w:r>
+              <w:rPr>
+                <w:sz w:val="22"/>
+                <w:szCs w:val="22"/>
+              </w:rPr>
               <w:t>Clearer, more professional replies, fewer errors, faster</w:t>
             </w:r>
           </w:p>
@@ -636,9 +729,23 @@
         <w:tc>
           <w:tcPr>
             <w:tcW w:type="dxa" w:w="3364"/>
+            <w:vAlign w:val="center"/>
+            <w:tcMar>
+              <w:top w:w="60" w:type="dxa"/>
+              <w:bottom w:w="60" w:type="dxa"/>
+              <w:left w:w="110" w:type="dxa"/>
+              <w:right w:w="110" w:type="dxa"/>
+            </w:tcMar>
           </w:tcPr>
           <w:p>
+            <w:pPr>
+              <w:spacing w:after="40" w:before="40"/>
+            </w:pPr>
             <w:r>
+              <w:rPr>
+                <w:sz w:val="22"/>
+                <w:szCs w:val="22"/>
+              </w:rPr>
               <w:t>Detailed explanations and KB articles</w:t>
             </w:r>
           </w:p>
@@ -646,9 +753,23 @@
         <w:tc>
           <w:tcPr>
             <w:tcW w:type="dxa" w:w="3364"/>
+            <w:vAlign w:val="center"/>
+            <w:tcMar>
+              <w:top w:w="60" w:type="dxa"/>
+              <w:bottom w:w="60" w:type="dxa"/>
+              <w:left w:w="110" w:type="dxa"/>
+              <w:right w:w="110" w:type="dxa"/>
+            </w:tcMar>
           </w:tcPr>
           <w:p>
+            <w:pPr>
+              <w:spacing w:after="40" w:before="40"/>
+            </w:pPr>
             <w:r>
+              <w:rPr>
+                <w:sz w:val="22"/>
+                <w:szCs w:val="22"/>
+              </w:rPr>
               <w:t>ChatGPT, Claude</w:t>
             </w:r>
           </w:p>
@@ -656,9 +777,23 @@
         <w:tc>
           <w:tcPr>
             <w:tcW w:type="dxa" w:w="3364"/>
+            <w:vAlign w:val="center"/>
+            <w:tcMar>
+              <w:top w:w="60" w:type="dxa"/>
+              <w:bottom w:w="60" w:type="dxa"/>
+              <w:left w:w="110" w:type="dxa"/>
+              <w:right w:w="110" w:type="dxa"/>
+            </w:tcMar>
           </w:tcPr>
           <w:p>
+            <w:pPr>
+              <w:spacing w:after="40" w:before="40"/>
+            </w:pPr>
             <w:r>
+              <w:rPr>
+                <w:sz w:val="22"/>
+                <w:szCs w:val="22"/>
+              </w:rPr>
               <w:t>Faster, well-sourced answers with Sinch documentation links</w:t>
             </w:r>
           </w:p>
@@ -668,9 +803,23 @@
         <w:tc>
           <w:tcPr>
             <w:tcW w:type="dxa" w:w="3364"/>
+            <w:vAlign w:val="center"/>
+            <w:tcMar>
+              <w:top w:w="60" w:type="dxa"/>
+              <w:bottom w:w="60" w:type="dxa"/>
+              <w:left w:w="110" w:type="dxa"/>
+              <w:right w:w="110" w:type="dxa"/>
+            </w:tcMar>
           </w:tcPr>
           <w:p>
+            <w:pPr>
+              <w:spacing w:after="40" w:before="40"/>
+            </w:pPr>
             <w:r>
+              <w:rPr>
+                <w:sz w:val="22"/>
+                <w:szCs w:val="22"/>
+              </w:rPr>
               <w:t>Building reporting tools</w:t>
             </w:r>
           </w:p>
@@ -678,9 +827,23 @@
         <w:tc>
           <w:tcPr>
             <w:tcW w:type="dxa" w:w="3364"/>
+            <w:vAlign w:val="center"/>
+            <w:tcMar>
+              <w:top w:w="60" w:type="dxa"/>
+              <w:bottom w:w="60" w:type="dxa"/>
+              <w:left w:w="110" w:type="dxa"/>
+              <w:right w:w="110" w:type="dxa"/>
+            </w:tcMar>
           </w:tcPr>
           <w:p>
+            <w:pPr>
+              <w:spacing w:after="40" w:before="40"/>
+            </w:pPr>
             <w:r>
+              <w:rPr>
+                <w:sz w:val="22"/>
+                <w:szCs w:val="22"/>
+              </w:rPr>
               <w:t>ChatGPT, Claude</w:t>
             </w:r>
           </w:p>
@@ -688,9 +851,23 @@
         <w:tc>
           <w:tcPr>
             <w:tcW w:type="dxa" w:w="3364"/>
+            <w:vAlign w:val="center"/>
+            <w:tcMar>
+              <w:top w:w="60" w:type="dxa"/>
+              <w:bottom w:w="60" w:type="dxa"/>
+              <w:left w:w="110" w:type="dxa"/>
+              <w:right w:w="110" w:type="dxa"/>
+            </w:tcMar>
           </w:tcPr>
           <w:p>
+            <w:pPr>
+              <w:spacing w:after="40" w:before="40"/>
+            </w:pPr>
             <w:r>
+              <w:rPr>
+                <w:sz w:val="22"/>
+                <w:szCs w:val="22"/>
+              </w:rPr>
               <w:t>Automated portfolio reporting, days not weeks (see Part B)</w:t>
             </w:r>
           </w:p>

</xml_diff>